<commit_message>
19/10/2026 - 20:40 h
</commit_message>
<xml_diff>
--- a/Examinai tudo retende o bem/Examinai tudo retende o bem.docx
+++ b/Examinai tudo retende o bem/Examinai tudo retende o bem.docx
@@ -138,6 +138,238 @@
           <w:lang w:val="en-US" w:eastAsia="zh-CN" w:bidi="hi-IN"/>
         </w:rPr>
         <w:t xml:space="preserve"> sem abordamos a questão da leitura. Será que temos sido cautelosos ao escolher o tipo de material que lemos?</w:t>
+      </w:r>
+    </w:p>
+    <w:p>
+      <w:pPr>
+        <w:pStyle w:val="TextBody"/>
+        <w:jc w:val="both"/>
+        <w:rPr>
+          <w:sz w:val="36"/>
+          <w:szCs w:val="36"/>
+        </w:rPr>
+      </w:pPr>
+      <w:r>
+        <w:rPr/>
+      </w:r>
+    </w:p>
+    <w:p>
+      <w:pPr>
+        <w:pStyle w:val="TextBody"/>
+        <w:jc w:val="both"/>
+        <w:rPr>
+          <w:sz w:val="36"/>
+          <w:szCs w:val="36"/>
+        </w:rPr>
+      </w:pPr>
+      <w:r>
+        <w:rPr>
+          <w:rFonts w:eastAsia="Times New Roman" w:cs="Times New Roman" w:ascii="Garamond" w:hAnsi="Garamond"/>
+          <w:color w:val="000000"/>
+          <w:kern w:val="0"/>
+          <w:sz w:val="36"/>
+          <w:szCs w:val="36"/>
+          <w:shd w:fill="auto" w:val="clear"/>
+          <w:lang w:val="en-US" w:eastAsia="zh-CN" w:bidi="hi-IN"/>
+        </w:rPr>
+        <w:t>### Início comentários livro Goethe</w:t>
+      </w:r>
+    </w:p>
+    <w:p>
+      <w:pPr>
+        <w:pStyle w:val="TextBody"/>
+        <w:jc w:val="both"/>
+        <w:rPr>
+          <w:sz w:val="36"/>
+          <w:szCs w:val="36"/>
+        </w:rPr>
+      </w:pPr>
+      <w:r>
+        <w:rPr/>
+      </w:r>
+    </w:p>
+    <w:p>
+      <w:pPr>
+        <w:pStyle w:val="TextBody"/>
+        <w:jc w:val="both"/>
+        <w:rPr>
+          <w:sz w:val="36"/>
+          <w:szCs w:val="36"/>
+        </w:rPr>
+      </w:pPr>
+      <w:r>
+        <w:rPr>
+          <w:rFonts w:eastAsia="Times New Roman" w:cs="Times New Roman" w:ascii="Garamond" w:hAnsi="Garamond"/>
+          <w:color w:val="000000"/>
+          <w:kern w:val="0"/>
+          <w:sz w:val="36"/>
+          <w:szCs w:val="36"/>
+          <w:shd w:fill="auto" w:val="clear"/>
+          <w:lang w:val="en-US" w:eastAsia="zh-CN" w:bidi="hi-IN"/>
+        </w:rPr>
+        <w:t>Ao refletirmos sobre a leitura, vale lembrar um episódio da história da literatura. Em 1774, o escritor alemão Goethe publicou *Os sofrimentos do jovem Werther*, romance cujo protagonista morre por suicídio. A obra alcançou enorme popularidade e passou a ser acusada de estimular imitações de sua tragédia. Alguns lugares chegaram a proibi-la.</w:t>
+      </w:r>
+    </w:p>
+    <w:p>
+      <w:pPr>
+        <w:pStyle w:val="TextBody"/>
+        <w:jc w:val="both"/>
+        <w:rPr>
+          <w:sz w:val="36"/>
+          <w:szCs w:val="36"/>
+        </w:rPr>
+      </w:pPr>
+      <w:r>
+        <w:rPr/>
+      </w:r>
+    </w:p>
+    <w:p>
+      <w:pPr>
+        <w:pStyle w:val="TextBody"/>
+        <w:jc w:val="both"/>
+        <w:rPr>
+          <w:sz w:val="36"/>
+          <w:szCs w:val="36"/>
+        </w:rPr>
+      </w:pPr>
+      <w:r>
+        <w:rPr>
+          <w:rFonts w:eastAsia="Times New Roman" w:cs="Times New Roman" w:ascii="Garamond" w:hAnsi="Garamond"/>
+          <w:color w:val="000000"/>
+          <w:kern w:val="0"/>
+          <w:sz w:val="36"/>
+          <w:szCs w:val="36"/>
+          <w:shd w:fill="auto" w:val="clear"/>
+          <w:lang w:val="en-US" w:eastAsia="zh-CN" w:bidi="hi-IN"/>
+        </w:rPr>
+        <w:t>Pesquisas posteriores, contudo, mostraram que a alegada epidemia de suicídios não está historicamente comprovada nos termos em que foi divulgada.</w:t>
+      </w:r>
+    </w:p>
+    <w:p>
+      <w:pPr>
+        <w:pStyle w:val="TextBody"/>
+        <w:jc w:val="both"/>
+        <w:rPr>
+          <w:sz w:val="36"/>
+          <w:szCs w:val="36"/>
+        </w:rPr>
+      </w:pPr>
+      <w:r>
+        <w:rPr/>
+      </w:r>
+    </w:p>
+    <w:p>
+      <w:pPr>
+        <w:pStyle w:val="TextBody"/>
+        <w:jc w:val="both"/>
+        <w:rPr>
+          <w:sz w:val="36"/>
+          <w:szCs w:val="36"/>
+        </w:rPr>
+      </w:pPr>
+      <w:r>
+        <w:rPr>
+          <w:rFonts w:eastAsia="Times New Roman" w:cs="Times New Roman" w:ascii="Garamond" w:hAnsi="Garamond"/>
+          <w:color w:val="000000"/>
+          <w:kern w:val="0"/>
+          <w:sz w:val="36"/>
+          <w:szCs w:val="36"/>
+          <w:shd w:fill="auto" w:val="clear"/>
+          <w:lang w:val="en-US" w:eastAsia="zh-CN" w:bidi="hi-IN"/>
+        </w:rPr>
+        <w:t>Esse episódio nos convida a uma reflexão: não devemos aceitar automaticamente nem a acusação contra um livro, nem a ideia de que todo livro, por ser admirado ou consagrado, necessariamente nos faz bem. Precisamos examinar o conteúdo, compreender sua influência e avaliar seus efeitos com discernimento.</w:t>
+      </w:r>
+    </w:p>
+    <w:p>
+      <w:pPr>
+        <w:pStyle w:val="TextBody"/>
+        <w:jc w:val="both"/>
+        <w:rPr>
+          <w:sz w:val="36"/>
+          <w:szCs w:val="36"/>
+        </w:rPr>
+      </w:pPr>
+      <w:r>
+        <w:rPr/>
+      </w:r>
+    </w:p>
+    <w:p>
+      <w:pPr>
+        <w:pStyle w:val="TextBody"/>
+        <w:jc w:val="both"/>
+        <w:rPr>
+          <w:sz w:val="36"/>
+          <w:szCs w:val="36"/>
+        </w:rPr>
+      </w:pPr>
+      <w:r>
+        <w:rPr>
+          <w:rFonts w:eastAsia="Times New Roman" w:cs="Times New Roman" w:ascii="Garamond" w:hAnsi="Garamond"/>
+          <w:color w:val="000000"/>
+          <w:kern w:val="0"/>
+          <w:sz w:val="36"/>
+          <w:szCs w:val="36"/>
+          <w:shd w:fill="auto" w:val="clear"/>
+          <w:lang w:val="en-US" w:eastAsia="zh-CN" w:bidi="hi-IN"/>
+        </w:rPr>
+        <w:t>É nesse espírito que podemos recordar a recomendação do apóstolo Paulo: “Examinai tudo. Retende o bem” (1 Tessalonicenses 5:21).</w:t>
+      </w:r>
+    </w:p>
+    <w:p>
+      <w:pPr>
+        <w:pStyle w:val="TextBody"/>
+        <w:jc w:val="both"/>
+        <w:rPr>
+          <w:sz w:val="36"/>
+          <w:szCs w:val="36"/>
+        </w:rPr>
+      </w:pPr>
+      <w:r>
+        <w:rPr/>
+      </w:r>
+    </w:p>
+    <w:p>
+      <w:pPr>
+        <w:pStyle w:val="TextBody"/>
+        <w:jc w:val="both"/>
+        <w:rPr>
+          <w:sz w:val="36"/>
+          <w:szCs w:val="36"/>
+        </w:rPr>
+      </w:pPr>
+      <w:r>
+        <w:rPr>
+          <w:rFonts w:eastAsia="Times New Roman" w:cs="Times New Roman" w:ascii="Garamond" w:hAnsi="Garamond"/>
+          <w:color w:val="000000"/>
+          <w:kern w:val="0"/>
+          <w:sz w:val="36"/>
+          <w:szCs w:val="36"/>
+          <w:shd w:fill="auto" w:val="clear"/>
+          <w:lang w:val="en-US" w:eastAsia="zh-CN" w:bidi="hi-IN"/>
+        </w:rPr>
+        <w:t>Aplicada à leitura, essa orientação nos convida a não entregar nosso discernimento a nenhum autor, por mais respeitado que seja. Leiamo-lo com atenção, aproveitemos aquilo que contribui para nosso crescimento e conservemos a liberdade de avaliar criticamente o que encontramos.</w:t>
+      </w:r>
+    </w:p>
+    <w:p>
+      <w:pPr>
+        <w:pStyle w:val="TextBody"/>
+        <w:jc w:val="both"/>
+        <w:rPr>
+          <w:sz w:val="36"/>
+          <w:szCs w:val="36"/>
+        </w:rPr>
+      </w:pPr>
+      <w:r>
+        <w:rPr>
+          <w:rFonts w:eastAsia="Times New Roman" w:cs="Times New Roman" w:ascii="Garamond" w:hAnsi="Garamond"/>
+          <w:color w:val="000000"/>
+          <w:kern w:val="0"/>
+          <w:sz w:val="36"/>
+          <w:szCs w:val="36"/>
+          <w:shd w:fill="auto" w:val="clear"/>
+          <w:lang w:val="en-US" w:eastAsia="zh-CN" w:bidi="hi-IN"/>
+        </w:rPr>
+        <w:t>### Término comentários livro Goethe</w:t>
       </w:r>
     </w:p>
     <w:p>
@@ -2117,7 +2349,7 @@
         <w:bCs/>
         <w:rFonts w:ascii="Garamond" w:hAnsi="Garamond"/>
       </w:rPr>
-      <w:t>11</w:t>
+      <w:t>13</w:t>
     </w:r>
     <w:r>
       <w:rPr>

</xml_diff>